<commit_message>
Fix wording in report explainability section
</commit_message>
<xml_diff>
--- a/reports/final_report.docx
+++ b/reports/final_report.docx
@@ -137,7 +137,7 @@
         </w:rPr>
         <w:t xml:space="preserve">GitHub: </w:t>
       </w:r>
-      <w:hyperlink w:history="1" r:id="rId9j1idzrh0xcd9489od94x">
+      <w:hyperlink w:history="1" r:id="rIdyn-pzm5hmb8okasusc6ir">
         <w:r>
           <w:rPr>
             <w:rFonts w:ascii="Arial" w:cs="Arial" w:eastAsia="Arial" w:hAnsi="Arial"/>
@@ -21975,7 +21975,7 @@
           <w:sz w:val="22"/>
           <w:szCs w:val="22"/>
         </w:rPr>
-        <w:t xml:space="preserve">The waterfall above explains one recommendation. The customer bought the same jacket the day before the target week (rep_days_since = 0), which alone adds 2.48 to the log-odds, and had bought another variant of it too. The predicted chance went from about 1% for an average candidate to about 66%. A repeat buy within days is most likely a size swap or a second unit.</w:t>
+        <w:t xml:space="preserve">The waterfall above explains one recommendation. The customer bought the same jacket the day before the target week (rep_days_since = 0), which alone adds 2.48 to the log-odds, and had bought another variant of it too. The predicted chance went from under 1% for an average candidate to about 66%. A repeat buy within days is most likely a size swap or a second unit.</w:t>
       </w:r>
     </w:p>
     <w:p>
@@ -28278,7 +28278,7 @@
         </w:rPr>
         <w:t xml:space="preserve">Repo: </w:t>
       </w:r>
-      <w:hyperlink w:history="1" r:id="rIdtgrse6mjpdqzllnkr-ffh">
+      <w:hyperlink w:history="1" r:id="rIddypcpc_3a6nyrr6an4fju">
         <w:r>
           <w:rPr>
             <w:rFonts w:ascii="Arial" w:cs="Arial" w:eastAsia="Arial" w:hAnsi="Arial"/>

</xml_diff>